<commit_message>
feat(propuesta-optimizada): rev2 del articulado y paquete de descarga final
- Art. 16: paridad de exportación del metanol (título 'importación y
  exportación'); art. 12: excepción eléctrica limitada a turbinas +
  párrafo de motores alternativos de combustión interna.
- Popups de fundamentos 12 y 16 actualizados en consonancia.
- Descarga: Word rev2 de la propuesta y PDF de Fundamentos rev2.

Co-Authored-By: Claude Fable 5 <noreply@anthropic.com>
</commit_message>
<xml_diff>
--- a/descargas/propuesta-ley-s0809-2026-optimizada.docx
+++ b/descargas/propuesta-ley-s0809-2026-optimizada.docx
@@ -987,8 +987,6 @@
       <w:ins w:id="15" w:author="Hilarion Del Olmo" w:date="2026-08-28T10:32:00Z" w16du:dateUtc="2026-08-28T13:32:00Z">
         <w:r>
           <w:t xml:space="preserve">Biodiesel de segunda generación: el que acredite, mediante certificación emitida por un esquema de sustentabilidad reconocido internacionalmente, una reducción de emisiones de gases de efecto invernadero por unidad de energía igual o superior al NOVENTA POR </w:t>
-        </w:r>
-        <w:r>
           <w:lastRenderedPageBreak/>
           <w:t>CIENTO (90%) respecto del combustible fósil sustituido, conforme los valores de referencia que establezca la reglamentación.</w:t>
         </w:r>
@@ -1012,23 +1010,7 @@
       </w:pPr>
       <w:ins w:id="18" w:author="Hilarion Del Olmo" w:date="2026-08-28T10:32:00Z" w16du:dateUtc="2026-08-28T13:32:00Z">
         <w:r>
-          <w:t xml:space="preserve">El valor de emisión por defecto para el gasoil y la nafta de origen fósil se fija en noventa y cuatro gramos de dióxido de carbono equivalente por </w:t>
-        </w:r>
-        <w:proofErr w:type="spellStart"/>
-        <w:r>
-          <w:t>megajulio</w:t>
-        </w:r>
-        <w:proofErr w:type="spellEnd"/>
-        <w:r>
-          <w:t xml:space="preserve"> (94 gCO2eq/MJ) y noventa y tres coma tres gramos de dióxido de carbono equivalente por </w:t>
-        </w:r>
-        <w:proofErr w:type="spellStart"/>
-        <w:r>
-          <w:t>megajulio</w:t>
-        </w:r>
-        <w:proofErr w:type="spellEnd"/>
-        <w:r>
-          <w:t xml:space="preserve"> (93,3 gCO2eq/MJ), respectivamente, pudiendo dichos valores ser actualizados por la Autoridad de Aplicación mediante acto fundado.</w:t>
+          <w:t xml:space="preserve">El valor de emisión por defecto para el gasoil y la nafta de origen fósil se fija en noventa y cuatro gramos de dióxido de carbono equivalente por megajulio (94 gCO2eq/MJ) y noventa y tres coma tres gramos de dióxido de carbono equivalente por megajulio (93,3 gCO2eq/MJ), respectivamente, pudiendo dichos valores ser actualizados por la Autoridad de Aplicación mediante acto fundado.</w:t>
         </w:r>
       </w:ins>
     </w:p>
@@ -1100,11 +1082,6 @@
         <w:rPr>
           <w:ins w:id="26" w:author="Hilarion Del Olmo" w:date="2026-08-28T10:31:00Z" w16du:dateUtc="2026-08-28T13:31:00Z"/>
           <w:lang w:val="es-ES"/>
-          <w:rPrChange w:id="27" w:author="Hilarion Del Olmo" w:date="2026-08-28T10:33:00Z" w16du:dateUtc="2026-08-28T13:33:00Z">
-            <w:rPr>
-              <w:ins w:id="28" w:author="Hilarion Del Olmo" w:date="2026-08-28T10:31:00Z" w16du:dateUtc="2026-08-28T13:31:00Z"/>
-            </w:rPr>
-          </w:rPrChange>
         </w:rPr>
       </w:pPr>
       <w:ins w:id="29" w:author="Hilarion Del Olmo" w:date="2026-08-28T10:32:00Z" w16du:dateUtc="2026-08-28T13:32:00Z">
@@ -1658,8 +1635,6 @@
       </w:r>
       <w:r>
         <w:t xml:space="preserve"> Mezcla obligatoria de biocombustibles con combustibles fósiles. Gas Oil. Establécese que todo combustible líquido clasificado como gasoil o diésel oil - conforme la normativa de calidad de combustibles vigente o la que en el futuro la reemplace- que se comercialice dentro del territorio nacional deberá contener un porcentaje de mezcla mínimo obligatorio, en volumen, medido sobre la cantidad total del producto final comercializado, del SIETE COMA CINCO POR CIENTO (7,5%) de biodiesel. A partir de los DOCE (12) meses de </w:t>
-      </w:r>
-      <w:r>
         <w:lastRenderedPageBreak/>
         <w:t xml:space="preserve">la sanción de la ley, el porcentaje de mezcla mínimo obligatorio, en volumen, medido sobre la cantidad total del producto final comercializado, será del DIEZ POR CIENTO (10%) de biodiesel. </w:t>
       </w:r>
@@ -1728,8 +1703,34 @@
         <w:ind w:left="-5" w:right="0"/>
       </w:pPr>
       <w:r>
-        <w:t xml:space="preserve">Quedará exceptuado de la mezcla obligatoria con biodiesel el gasoil o diésel oil comercializado para ser utilizado en embarcaciones fluviales y marítimas, minería, combustibles de primer llenado, gasoil antártico, formulación de lodos de perforación en yacimientos, centrales eléctricas y zonas frías patagónicas; así como otras excepciones que mediante acto fundado determine la autoridad de aplicación. </w:t>
-      </w:r>
+        <w:t xml:space="preserve">Quedará exceptuado de la mezcla obligatoria con biodiesel el gasoil o diésel oil comercializado para ser utilizado en embarcaciones fluviales y marítimas, minería, combustibles de primer llenado, gasoil antártico, formulación de lodos de perforación en yacimientos, </w:t>
+      </w:r>
+      <w:del w:id="15002" w:author="Hilarion Del Olmo" w:date="2026-09-01T18:00:00Z">
+        <w:r>
+          <w:delText xml:space="preserve">centrales eléctricas</w:delText>
+        </w:r>
+      </w:del>
+      <w:ins w:id="15003" w:author="Hilarion Del Olmo" w:date="2026-09-01T18:00:00Z">
+        <w:r>
+          <w:t xml:space="preserve">turbinas destinadas a la generación de energía eléctrica</w:t>
+        </w:r>
+      </w:ins>
+      <w:r>
+        <w:t xml:space="preserve"> y zonas frías patagónicas; así como otras excepciones que mediante acto fundado determine la autoridad de aplicación. </w:t>
+      </w:r>
+    </w:p>
+    <w:p>
+      <w:pPr>
+        <w:ind w:left="-5" w:right="0"/>
+        <w:rPr>
+          <w:ins w:id="15004" w:author="Hilarion Del Olmo" w:date="2026-09-01T18:00:00Z"/>
+        </w:rPr>
+      </w:pPr>
+      <w:ins w:id="15005" w:author="Hilarion Del Olmo" w:date="2026-09-01T18:00:00Z">
+        <w:r>
+          <w:t xml:space="preserve">La excepción correspondiente a la generación de energía eléctrica no será aplicable al gasoil o diésel oil destinado a motores alternativos de combustión interna, incluidos los motores de encendido por compresión utilizados para la generación de energía eléctrica.</w:t>
+        </w:r>
+      </w:ins>
     </w:p>
     <w:p>
       <w:pPr>
@@ -2244,8 +2245,6 @@
       <w:ins w:id="103" w:author="Hilarion Del Olmo" w:date="2026-08-27T08:35:00Z">
         <w:r>
           <w:t xml:space="preserve">El biodiesel de segunda generación adjudicado, efectivamente entregado y certificado computará por DOS (2) a los fines del cumplimiento del corte obligatorio del mezclador adquirente, dentro del cómputo máximo previsto en el artículo 38. Su precio de liquidación </w:t>
-        </w:r>
-        <w:r>
           <w:lastRenderedPageBreak/>
           <w:t xml:space="preserve">será equivalente al DOBLE del precio ofertado y en ningún caso podrá superar UNO COMA CINCO (1,5) veces el precio de cierre del Segmento Competitivo Empresas No Integradas. </w:t>
         </w:r>
@@ -2387,7 +2386,15 @@
         <w:t>ARTÍCULO 16.-</w:t>
       </w:r>
       <w:r>
-        <w:t xml:space="preserve"> Precios de referencia de paridad de importación. Como referencia en el marco del mecanismo del artículo 24,  se publicarán los valores que se indican a continuación: </w:t>
+        <w:t xml:space="preserve"> Precios de referencia de paridad de importación</w:t>
+      </w:r>
+      <w:ins w:id="15001" w:author="Hilarion Del Olmo" w:date="2026-09-01T18:00:00Z">
+        <w:r>
+          <w:t xml:space="preserve"> y exportación</w:t>
+        </w:r>
+      </w:ins>
+      <w:r>
+        <w:t xml:space="preserve">. Como referencia en el marco del mecanismo del artículo 24,  se publicarán los valores que se indican a continuación: </w:t>
       </w:r>
     </w:p>
     <w:p>
@@ -2476,7 +2483,7 @@
       </w:r>
       <w:ins w:id="114" w:author="Hilarion Del Olmo" w:date="2026-08-26T12:00:00Z">
         <w:r>
-          <w:t xml:space="preserve"> Dichos valores tendrán carácter exclusivamente informativo y de referencia. Se publicarán asimismo la paridad de importación del metanol y los volúmenes consumidos y precios del combustible co-procesado y de su componente biogénico certificado.</w:t>
+          <w:t xml:space="preserve"> Dichos valores tendrán carácter exclusivamente informativo y de referencia. Se publicarán asimismo la paridad de exportación del metanol y los volúmenes consumidos y precios del combustible co-procesado y de su componente biogénico certificado.</w:t>
         </w:r>
       </w:ins>
       <w:r>
@@ -3102,8 +3109,6 @@
       </w:r>
       <w:r>
         <w:t xml:space="preserve"> Funciones de fiscalización y control técnico. La Autoridad de Aplicación podrá celebrar convenios para delegar sus funciones de fiscalización y control técnico en organismos públicos o privados que acrediten la competencia necesaria. Asimismo, podrá </w:t>
-      </w:r>
-      <w:r>
         <w:lastRenderedPageBreak/>
         <w:t xml:space="preserve">celebrar convenios específicos con las Provincias y la CIUDAD AUTÓNOMA DE BUENOS AIRES para delegar el ejercicio de sus facultades. </w:t>
       </w:r>
@@ -3751,10 +3756,7 @@
         <w:t>ARTÍCULO 36.-</w:t>
       </w:r>
       <w:r>
-        <w:t xml:space="preserve"> Definiciones</w:t>
-      </w:r>
-      <w:r>
-        <w:t xml:space="preserve">. </w:t>
+        <w:t xml:space="preserve"> Definiciones. </w:t>
       </w:r>
       <w:ins w:id="137" w:author="Hilarion Del Olmo" w:date="2026-08-28T10:19:00Z" w16du:dateUtc="2026-08-28T13:19:00Z">
         <w:r>
@@ -3762,11 +3764,6 @@
             <w:rStyle w:val="Strong"/>
             <w:b w:val="0"/>
             <w:bCs w:val="0"/>
-            <w:rPrChange w:id="138" w:author="Hilarion Del Olmo" w:date="2026-08-28T10:19:00Z" w16du:dateUtc="2026-08-28T13:19:00Z">
-              <w:rPr>
-                <w:rStyle w:val="Strong"/>
-              </w:rPr>
-            </w:rPrChange>
           </w:rPr>
           <w:t>A los efectos de la presente ley</w:t>
         </w:r>
@@ -3780,10 +3777,7 @@
         </w:r>
       </w:del>
       <w:r>
-        <w:t>se</w:t>
-      </w:r>
-      <w:r>
-        <w:t xml:space="preserve"> entiende por: </w:t>
+        <w:t xml:space="preserve">se entiende por: </w:t>
       </w:r>
     </w:p>
     <w:p>
@@ -3950,6 +3944,11 @@
           <w:ins w:id="140" w:author="Hilarion Del Olmo" w:date="2026-08-28T09:38:00Z" w16du:dateUtc="2026-08-28T12:38:00Z"/>
         </w:rPr>
       </w:pPr>
+      <w:del w:id="15900" w:author="Hilarion Del Olmo" w:date="2026-09-01T18:00:00Z">
+        <w:r>
+          <w:delText xml:space="preserve">d) </w:delText>
+        </w:r>
+      </w:del>
       <w:r>
         <w:t xml:space="preserve">Cómputo máximo: El cupo máximo de valor de porcentaje de corte obligatorio de biodiesel que las mezcladoras podrán </w:t>
       </w:r>
@@ -3960,12 +3959,7 @@
       </w:del>
       <w:ins w:id="142" w:author="Hilarion Del Olmo" w:date="2026-08-27T18:00:00Z">
         <w:r>
-          <w:t>computar</w:t>
-        </w:r>
-      </w:ins>
-      <w:ins w:id="143" w:author="Hilarion Del Olmo" w:date="2026-08-26T12:00:00Z">
-        <w:r>
-          <w:t xml:space="preserve"> por aplicación del cómputo doble del biodiesel de segunda generación previsto en el artículo 14</w:t>
+          <w:t xml:space="preserve">computar por aplicación del cómputo doble del biodiesel de segunda generación previsto en el artículo 14</w:t>
         </w:r>
       </w:ins>
       <w:r>
@@ -8054,17 +8048,7 @@
       </w:del>
       <w:ins w:id="407" w:author="Hilarion Del Olmo" w:date="2026-08-26T12:00:00Z">
         <w:r>
-          <w:t xml:space="preserve">por año calendario. Estos límites se aplicarán a la totalidad del biodiesel físico destinado al cumplimiento de la mezcla obligatoria, cualquiera sea el segmento </w:t>
-        </w:r>
-      </w:ins>
-      <w:ins w:id="408" w:author="Hilarion Del Olmo" w:date="2026-08-28T09:44:00Z" w16du:dateUtc="2026-08-28T12:44:00Z">
-        <w:r>
-          <w:t xml:space="preserve">al que pertenezcan </w:t>
-        </w:r>
-      </w:ins>
-      <w:ins w:id="409" w:author="Hilarion Del Olmo" w:date="2026-08-26T12:00:00Z">
-        <w:r>
-          <w:t>o la modalidad contractual;</w:t>
+          <w:t xml:space="preserve">por año calendario. Estos límites se aplicarán a la totalidad del biodiesel físico destinado al cumplimiento de la mezcla obligatoria, cualquiera sea el segmento al que pertenezcan o la modalidad contractual;</w:t>
         </w:r>
       </w:ins>
       <w:r>
@@ -8230,75 +8214,12 @@
       </w:pPr>
       <w:ins w:id="423" w:author="Hilarion Del Olmo" w:date="2026-08-28T09:59:00Z" w16du:dateUtc="2026-08-28T12:59:00Z">
         <w:r>
-          <w:t xml:space="preserve"> </w:t>
-        </w:r>
-        <w:r>
-          <w:t xml:space="preserve">Finalizado el período de abastecimiento, todo volumen faltante para el cumplimiento del corte obligatorio </w:t>
-        </w:r>
-      </w:ins>
-      <w:ins w:id="424" w:author="Hilarion Del Olmo" w:date="2026-08-28T10:02:00Z" w16du:dateUtc="2026-08-28T13:02:00Z">
-        <w:r>
-          <w:t>s</w:t>
-        </w:r>
-      </w:ins>
-      <w:ins w:id="425" w:author="Hilarion Del Olmo" w:date="2026-08-28T10:03:00Z" w16du:dateUtc="2026-08-28T13:03:00Z">
-        <w:r>
-          <w:t>e sumará al</w:t>
-        </w:r>
-      </w:ins>
-      <w:ins w:id="426" w:author="Hilarion Del Olmo" w:date="2026-08-28T10:04:00Z" w16du:dateUtc="2026-08-28T13:04:00Z">
-        <w:r>
-          <w:t xml:space="preserve"> volumen </w:t>
-        </w:r>
-      </w:ins>
-      <w:ins w:id="427" w:author="Hilarion Del Olmo" w:date="2026-08-28T10:05:00Z" w16du:dateUtc="2026-08-28T13:05:00Z">
-        <w:r>
-          <w:t>de la</w:t>
-        </w:r>
-      </w:ins>
-      <w:ins w:id="428" w:author="Hilarion Del Olmo" w:date="2026-08-28T10:06:00Z" w16du:dateUtc="2026-08-28T13:06:00Z">
-        <w:r>
-          <w:t xml:space="preserve"> subasta </w:t>
-        </w:r>
-      </w:ins>
-      <w:ins w:id="429" w:author="Hilarion Del Olmo" w:date="2026-08-28T10:07:00Z" w16du:dateUtc="2026-08-28T13:07:00Z">
-        <w:r>
-          <w:t xml:space="preserve">correspondiente al mes </w:t>
-        </w:r>
-      </w:ins>
-      <w:ins w:id="430" w:author="Hilarion Del Olmo" w:date="2026-08-28T10:06:00Z" w16du:dateUtc="2026-08-28T13:06:00Z">
-        <w:r>
-          <w:t xml:space="preserve">siguiente </w:t>
-        </w:r>
-      </w:ins>
-      <w:ins w:id="431" w:author="Hilarion Del Olmo" w:date="2026-08-28T10:07:00Z" w16du:dateUtc="2026-08-28T13:07:00Z">
-        <w:r>
-          <w:t xml:space="preserve">de </w:t>
-        </w:r>
-      </w:ins>
-      <w:ins w:id="432" w:author="Hilarion Del Olmo" w:date="2026-08-28T10:04:00Z" w16du:dateUtc="2026-08-28T13:04:00Z">
-        <w:r>
-          <w:t xml:space="preserve"> la subasta inmediata posterior</w:t>
-        </w:r>
-      </w:ins>
-      <w:ins w:id="433" w:author="Hilarion Del Olmo" w:date="2026-08-28T10:09:00Z" w16du:dateUtc="2026-08-28T13:09:00Z">
-        <w:r>
-          <w:t>.</w:t>
+          <w:t xml:space="preserve"> Finalizado el período de abastecimiento, todo volumen faltante para el cumplimiento del corte obligatorio se sumará al volumen de la subasta correspondiente al mes siguiente de  la subasta inmediata posterior.</w:t>
         </w:r>
       </w:ins>
       <w:del w:id="434" w:author="Hilarion Del Olmo" w:date="2026-08-28T09:59:00Z" w16du:dateUtc="2026-08-28T12:59:00Z">
         <w:r>
-          <w:delText xml:space="preserve">Todo volumen faltante para el cumplimiento del corte obligatorio </w:delText>
-        </w:r>
-      </w:del>
-      <w:del w:id="435" w:author="Hilarion Del Olmo" w:date="2026-08-28T09:45:00Z" w16du:dateUtc="2026-08-28T12:45:00Z">
-        <w:r>
-          <w:delText xml:space="preserve">podrá </w:delText>
-        </w:r>
-      </w:del>
-      <w:del w:id="436" w:author="Hilarion Del Olmo" w:date="2026-08-28T09:59:00Z" w16du:dateUtc="2026-08-28T12:59:00Z">
-        <w:r>
-          <w:delText xml:space="preserve">ser negociado libremente entre elaboradores y mezcladores. </w:delText>
+          <w:delText xml:space="preserve">Todo volumen faltante para el cumplimiento del corte obligatorio podrá ser negociado libremente entre elaboradores y mezcladores. </w:delText>
         </w:r>
       </w:del>
     </w:p>
@@ -8691,8 +8612,6 @@
       </w:pPr>
       <w:r>
         <w:t xml:space="preserve">A partir de reglas orientadas a la competencia, la transparencia y la libertad contractual, se busca potenciar el desarrollo de los biocombustibles, facilitando así el acceso a mercados </w:t>
-      </w:r>
-      <w:r>
         <w:lastRenderedPageBreak/>
         <w:t xml:space="preserve">internacionales. Este nuevo enfoque es un factor positivo para el desarrollo económico de nuestro país, ya que contribuye a un mejoramiento sostenido de la balanza de pagos. </w:t>
       </w:r>

</xml_diff>